<commit_message>
fix: remove excluded career entries from portfolio and resume
</commit_message>
<xml_diff>
--- a/career-document/오인성_경력기술서.docx
+++ b/career-document/오인성_경력기술서.docx
@@ -221,7 +221,7 @@
           <w:color w:val="000000"/>
           <w:sz w:val="22"/>
         </w:rPr>
-        <w:t>모바일개발부 연구원으로서 PowerGraphics Android 애플리케이션·차트 SDK 개발과 유지보수, MTS 메인 데이터 연동, EasyChart 화면·컨트롤 개발, LS증권 투혼 통합 검증과 개발 문서화를 담당했습니다. 정확성과 안정성이 중요한 금융 시스템에서 화면 상태, 데이터 요청, 엔진 속성, 운영 버전의 정합성을 함께 관리했습니다.</w:t>
+        <w:t>모바일개발부 연구원으로서 PowerGraphics Android 애플리케이션·차트 SDK 개발과 유지보수, EasyChart 화면·컨트롤 개발을 담당했습니다. 정확성과 안정성이 중요한 금융 시스템에서 화면 상태와 엔진 속성, 운영 버전의 정합성을 함께 관리했습니다.</w:t>
       </w:r>
     </w:p>
     <w:p>
@@ -258,60 +258,6 @@
           <w:sz w:val="21"/>
         </w:rPr>
         <w:t xml:space="preserve"> — Kotlin·Java 기반 신규 화면, 재사용 컨트롤, 차트 SDK 기능을 설계하고 운영 이슈를 안정화</w:t>
-      </w:r>
-    </w:p>
-    <w:p>
-      <w:pPr>
-        <w:pStyle w:val="ListBullet"/>
-        <w:ind w:left="504" w:hanging="259"/>
-        <w:spacing w:before="0" w:after="100" w:line="264" w:lineRule="auto"/>
-      </w:pPr>
-      <w:r>
-        <w:rPr>
-          <w:rFonts w:ascii="Nanum Gothic" w:hAnsi="Nanum Gothic" w:eastAsia="Nanum Gothic"/>
-          <w:b/>
-          <w:i w:val="0"/>
-          <w:color w:val="000000"/>
-          <w:sz w:val="21"/>
-        </w:rPr>
-        <w:t>레거시 Java 시스템과 Kotlin 모듈 통합</w:t>
-      </w:r>
-      <w:r>
-        <w:rPr>
-          <w:rFonts w:ascii="Nanum Gothic" w:hAnsi="Nanum Gothic" w:eastAsia="Nanum Gothic"/>
-          <w:b w:val="0"/>
-          <w:i w:val="0"/>
-          <w:color w:val="000000"/>
-          <w:sz w:val="21"/>
-        </w:rPr>
-        <w:t xml:space="preserve"> — 기존 MTS 구조를 유지하면서 AAR 기반 차트 SDK와 데이터·화면 경계를 연결하고 통합 검증</w:t>
-      </w:r>
-    </w:p>
-    <w:p>
-      <w:pPr>
-        <w:pStyle w:val="ListBullet"/>
-        <w:ind w:left="504" w:hanging="259"/>
-        <w:spacing w:before="0" w:after="100" w:line="264" w:lineRule="auto"/>
-      </w:pPr>
-      <w:r>
-        <w:rPr>
-          <w:rFonts w:ascii="Nanum Gothic" w:hAnsi="Nanum Gothic" w:eastAsia="Nanum Gothic"/>
-          <w:b/>
-          <w:i w:val="0"/>
-          <w:color w:val="000000"/>
-          <w:sz w:val="21"/>
-        </w:rPr>
-        <w:t>실시간·조회 데이터 연동과 상태 정합성 관리</w:t>
-      </w:r>
-      <w:r>
-        <w:rPr>
-          <w:rFonts w:ascii="Nanum Gothic" w:hAnsi="Nanum Gothic" w:eastAsia="Nanum Gothic"/>
-          <w:b w:val="0"/>
-          <w:i w:val="0"/>
-          <w:color w:val="000000"/>
-          <w:sz w:val="21"/>
-        </w:rPr>
-        <w:t xml:space="preserve"> — 시장·주기별 조회, 요청 큐, 연속 조회, 실시간 등록·해제와 UI·엔진 상태를 일관되게 제어</w:t>
       </w:r>
     </w:p>
     <w:p>
@@ -740,737 +686,7 @@
         <w:pageBreakBefore/>
       </w:pPr>
       <w:r>
-        <w:t>2. MTS 데이터 연동 및 LS증권 투혼 통합</w:t>
-      </w:r>
-    </w:p>
-    <w:p>
-      <w:pPr>
-        <w:keepNext/>
-        <w:spacing w:before="0" w:after="120" w:line="240" w:lineRule="auto"/>
-      </w:pPr>
-      <w:r>
-        <w:rPr>
-          <w:rFonts w:ascii="Nanum Gothic" w:hAnsi="Nanum Gothic" w:eastAsia="Nanum Gothic"/>
-          <w:b/>
-          <w:color w:val="5B6573"/>
-          <w:sz w:val="19"/>
-        </w:rPr>
-        <w:t>기간  2026.06 ~ 현재  |  역할  레거시 MTS·차트 SDK 통합, 조회·실시간 데이터 연동</w:t>
-      </w:r>
-    </w:p>
-    <w:p>
-      <w:pPr>
-        <w:keepNext w:val="0"/>
-        <w:spacing w:before="0" w:after="120" w:line="264" w:lineRule="auto"/>
-      </w:pPr>
-      <w:r>
-        <w:rPr>
-          <w:rFonts w:ascii="Nanum Gothic" w:hAnsi="Nanum Gothic" w:eastAsia="Nanum Gothic"/>
-          <w:b w:val="0"/>
-          <w:i w:val="0"/>
-          <w:color w:val="000000"/>
-          <w:sz w:val="22"/>
-        </w:rPr>
-        <w:t>Java 기반 LS증권 투혼 MTS에 Kotlin/AAR 형태의 PowerGraphics 차트 SDK를 연결했습니다. 기존 화면·컨트롤 구조와 빌드 구성을 유지하면서 MTS의 종목·시장·주기 조건이 차트의 데이터 요청과 화면 갱신으로 이어지도록 통합하고 개발 환경에서 검증했습니다.</w:t>
-      </w:r>
-    </w:p>
-    <w:p>
-      <w:pPr>
-        <w:pStyle w:val="Heading2"/>
-        <w:keepNext/>
-      </w:pPr>
-      <w:r>
-        <w:t>레거시 Java MTS와 Kotlin/AAR SDK 통합</w:t>
-      </w:r>
-    </w:p>
-    <w:p>
-      <w:pPr>
-        <w:pStyle w:val="ListBullet"/>
-        <w:ind w:left="504" w:hanging="259"/>
-        <w:spacing w:before="0" w:after="100" w:line="264" w:lineRule="auto"/>
-      </w:pPr>
-      <w:r>
-        <w:rPr>
-          <w:rFonts w:ascii="Nanum Gothic" w:hAnsi="Nanum Gothic" w:eastAsia="Nanum Gothic"/>
-          <w:b/>
-          <w:i w:val="0"/>
-          <w:color w:val="000000"/>
-          <w:sz w:val="21"/>
-        </w:rPr>
-        <w:t>모듈 경계 연결</w:t>
-      </w:r>
-      <w:r>
-        <w:rPr>
-          <w:rFonts w:ascii="Nanum Gothic" w:hAnsi="Nanum Gothic" w:eastAsia="Nanum Gothic"/>
-          <w:b w:val="0"/>
-          <w:i w:val="0"/>
-          <w:color w:val="000000"/>
-          <w:sz w:val="21"/>
-        </w:rPr>
-        <w:t xml:space="preserve"> — 기존 Java 호출부와 Kotlin SDK의 공개 인터페이스를 맞추고 앱 모듈, 차트 SDK, 엔진 산출물의 의존 관계를 정리</w:t>
-      </w:r>
-    </w:p>
-    <w:p>
-      <w:pPr>
-        <w:pStyle w:val="ListBullet"/>
-        <w:ind w:left="504" w:hanging="259"/>
-        <w:spacing w:before="0" w:after="100" w:line="264" w:lineRule="auto"/>
-      </w:pPr>
-      <w:r>
-        <w:rPr>
-          <w:rFonts w:ascii="Nanum Gothic" w:hAnsi="Nanum Gothic" w:eastAsia="Nanum Gothic"/>
-          <w:b/>
-          <w:i w:val="0"/>
-          <w:color w:val="000000"/>
-          <w:sz w:val="21"/>
-        </w:rPr>
-        <w:t>화면·컨트롤 통합</w:t>
-      </w:r>
-      <w:r>
-        <w:rPr>
-          <w:rFonts w:ascii="Nanum Gothic" w:hAnsi="Nanum Gothic" w:eastAsia="Nanum Gothic"/>
-          <w:b w:val="0"/>
-          <w:i w:val="0"/>
-          <w:color w:val="000000"/>
-          <w:sz w:val="21"/>
-        </w:rPr>
-        <w:t xml:space="preserve"> — MTS 메인에서 전달되는 종목, 시장, 주기, 조회 조건과 차트 화면의 생성·초기화·재조회 흐름을 연결</w:t>
-      </w:r>
-    </w:p>
-    <w:p>
-      <w:pPr>
-        <w:pStyle w:val="ListBullet"/>
-        <w:ind w:left="504" w:hanging="259"/>
-        <w:spacing w:before="0" w:after="100" w:line="264" w:lineRule="auto"/>
-      </w:pPr>
-      <w:r>
-        <w:rPr>
-          <w:rFonts w:ascii="Nanum Gothic" w:hAnsi="Nanum Gothic" w:eastAsia="Nanum Gothic"/>
-          <w:b/>
-          <w:i w:val="0"/>
-          <w:color w:val="000000"/>
-          <w:sz w:val="21"/>
-        </w:rPr>
-        <w:t>적용 상태 관리</w:t>
-      </w:r>
-      <w:r>
-        <w:rPr>
-          <w:rFonts w:ascii="Nanum Gothic" w:hAnsi="Nanum Gothic" w:eastAsia="Nanum Gothic"/>
-          <w:b w:val="0"/>
-          <w:i w:val="0"/>
-          <w:color w:val="000000"/>
-          <w:sz w:val="21"/>
-        </w:rPr>
-        <w:t xml:space="preserve"> — 소스 기반 검증과 패키징된 AAR 검증을 구분하고 실제 운영 반영 여부와 구현·통합 검증 결과를 분리해 기록</w:t>
-      </w:r>
-    </w:p>
-    <w:p>
-      <w:pPr>
-        <w:pStyle w:val="Heading2"/>
-        <w:keepNext/>
-      </w:pPr>
-      <w:r>
-        <w:t>조회 61종·실시간 21종 데이터 연동</w:t>
-      </w:r>
-    </w:p>
-    <w:p>
-      <w:pPr>
-        <w:pStyle w:val="ListBullet"/>
-        <w:ind w:left="504" w:hanging="259"/>
-        <w:spacing w:before="0" w:after="100" w:line="264" w:lineRule="auto"/>
-      </w:pPr>
-      <w:r>
-        <w:rPr>
-          <w:rFonts w:ascii="Nanum Gothic" w:hAnsi="Nanum Gothic" w:eastAsia="Nanum Gothic"/>
-          <w:b/>
-          <w:i w:val="0"/>
-          <w:color w:val="000000"/>
-          <w:sz w:val="21"/>
-        </w:rPr>
-        <w:t>조회 범위</w:t>
-      </w:r>
-      <w:r>
-        <w:rPr>
-          <w:rFonts w:ascii="Nanum Gothic" w:hAnsi="Nanum Gothic" w:eastAsia="Nanum Gothic"/>
-          <w:b w:val="0"/>
-          <w:i w:val="0"/>
-          <w:color w:val="000000"/>
-          <w:sz w:val="21"/>
-        </w:rPr>
-        <w:t xml:space="preserve"> — TR(업무 데이터 조회 단위) 61종을 국내외 주식·지수·선물·옵션 등 시장과 분/틱·일/주/월/년 주기별로 분기</w:t>
-      </w:r>
-    </w:p>
-    <w:p>
-      <w:pPr>
-        <w:pStyle w:val="ListBullet"/>
-        <w:ind w:left="504" w:hanging="259"/>
-        <w:spacing w:before="0" w:after="100" w:line="264" w:lineRule="auto"/>
-      </w:pPr>
-      <w:r>
-        <w:rPr>
-          <w:rFonts w:ascii="Nanum Gothic" w:hAnsi="Nanum Gothic" w:eastAsia="Nanum Gothic"/>
-          <w:b/>
-          <w:i w:val="0"/>
-          <w:color w:val="000000"/>
-          <w:sz w:val="21"/>
-        </w:rPr>
-        <w:t>실시간 범위</w:t>
-      </w:r>
-      <w:r>
-        <w:rPr>
-          <w:rFonts w:ascii="Nanum Gothic" w:hAnsi="Nanum Gothic" w:eastAsia="Nanum Gothic"/>
-          <w:b w:val="0"/>
-          <w:i w:val="0"/>
-          <w:color w:val="000000"/>
-          <w:sz w:val="21"/>
-        </w:rPr>
-        <w:t xml:space="preserve"> — 시세·체결 등 실시간 데이터 유형 21종을 시장별로 식별하고 차트 화면 생명주기에 맞춰 등록·해제</w:t>
-      </w:r>
-    </w:p>
-    <w:p>
-      <w:pPr>
-        <w:pStyle w:val="ListBullet"/>
-        <w:ind w:left="504" w:hanging="259"/>
-        <w:spacing w:before="0" w:after="100" w:line="264" w:lineRule="auto"/>
-      </w:pPr>
-      <w:r>
-        <w:rPr>
-          <w:rFonts w:ascii="Nanum Gothic" w:hAnsi="Nanum Gothic" w:eastAsia="Nanum Gothic"/>
-          <w:b/>
-          <w:i w:val="0"/>
-          <w:color w:val="000000"/>
-          <w:sz w:val="21"/>
-        </w:rPr>
-        <w:t>요청 큐와 식별자 관리</w:t>
-      </w:r>
-      <w:r>
-        <w:rPr>
-          <w:rFonts w:ascii="Nanum Gothic" w:hAnsi="Nanum Gothic" w:eastAsia="Nanum Gothic"/>
-          <w:b w:val="0"/>
-          <w:i w:val="0"/>
-          <w:color w:val="000000"/>
-          <w:sz w:val="21"/>
-        </w:rPr>
-        <w:t xml:space="preserve"> — 동시 요청을 순서화하고 화면 요청, 데이터 응답, 차트 인스턴스를 연결하는 매핑으로 교차 반영을 방지</w:t>
-      </w:r>
-    </w:p>
-    <w:p>
-      <w:pPr>
-        <w:pStyle w:val="ListBullet"/>
-        <w:ind w:left="504" w:hanging="259"/>
-        <w:spacing w:before="0" w:after="100" w:line="264" w:lineRule="auto"/>
-      </w:pPr>
-      <w:r>
-        <w:rPr>
-          <w:rFonts w:ascii="Nanum Gothic" w:hAnsi="Nanum Gothic" w:eastAsia="Nanum Gothic"/>
-          <w:b/>
-          <w:i w:val="0"/>
-          <w:color w:val="000000"/>
-          <w:sz w:val="21"/>
-        </w:rPr>
-        <w:t>연속 조회</w:t>
-      </w:r>
-      <w:r>
-        <w:rPr>
-          <w:rFonts w:ascii="Nanum Gothic" w:hAnsi="Nanum Gothic" w:eastAsia="Nanum Gothic"/>
-          <w:b w:val="0"/>
-          <w:i w:val="0"/>
-          <w:color w:val="000000"/>
-          <w:sz w:val="21"/>
-        </w:rPr>
-        <w:t xml:space="preserve"> — 초기 조회와 추가 조회의 연속 키를 관리하고 메인·추가·겹침 조회를 구분해 과거 데이터와 현재 화면을 안정적으로 병합</w:t>
-      </w:r>
-    </w:p>
-    <w:p>
-      <w:pPr>
-        <w:pStyle w:val="ListBullet"/>
-        <w:ind w:left="504" w:hanging="259"/>
-        <w:spacing w:before="0" w:after="100" w:line="264" w:lineRule="auto"/>
-      </w:pPr>
-      <w:r>
-        <w:rPr>
-          <w:rFonts w:ascii="Nanum Gothic" w:hAnsi="Nanum Gothic" w:eastAsia="Nanum Gothic"/>
-          <w:b/>
-          <w:i w:val="0"/>
-          <w:color w:val="000000"/>
-          <w:sz w:val="21"/>
-        </w:rPr>
-        <w:t>취소·초기화</w:t>
-      </w:r>
-      <w:r>
-        <w:rPr>
-          <w:rFonts w:ascii="Nanum Gothic" w:hAnsi="Nanum Gothic" w:eastAsia="Nanum Gothic"/>
-          <w:b w:val="0"/>
-          <w:i w:val="0"/>
-          <w:color w:val="000000"/>
-          <w:sz w:val="21"/>
-        </w:rPr>
-        <w:t xml:space="preserve"> — 종목·주기 변경과 화면 종료 시 대기 요청, 버퍼, 실시간 구독을 정리해 이전 화면 데이터가 재사용되지 않도록 제어</w:t>
-      </w:r>
-    </w:p>
-    <w:p>
-      <w:pPr>
-        <w:pStyle w:val="Heading2"/>
-        <w:keepNext/>
-      </w:pPr>
-      <w:r>
-        <w:t>통합 성과</w:t>
-      </w:r>
-    </w:p>
-    <w:p>
-      <w:pPr>
-        <w:pStyle w:val="ListBullet"/>
-        <w:ind w:left="504" w:hanging="259"/>
-        <w:spacing w:before="0" w:after="100" w:line="264" w:lineRule="auto"/>
-      </w:pPr>
-      <w:r>
-        <w:rPr>
-          <w:rFonts w:ascii="Nanum Gothic" w:hAnsi="Nanum Gothic" w:eastAsia="Nanum Gothic"/>
-          <w:b/>
-          <w:i w:val="0"/>
-          <w:color w:val="000000"/>
-          <w:sz w:val="21"/>
-        </w:rPr>
-        <w:t>데이터 생명주기 명확화</w:t>
-      </w:r>
-      <w:r>
-        <w:rPr>
-          <w:rFonts w:ascii="Nanum Gothic" w:hAnsi="Nanum Gothic" w:eastAsia="Nanum Gothic"/>
-          <w:b w:val="0"/>
-          <w:i w:val="0"/>
-          <w:color w:val="000000"/>
-          <w:sz w:val="21"/>
-        </w:rPr>
-        <w:t xml:space="preserve"> — 조회 요청 → 응답 파싱 → 차트 반영 → 실시간 갱신 → 해제 단계를 분리해 오류 위치와 재현 조건을 빠르게 좁힐 수 있게 구성</w:t>
-      </w:r>
-    </w:p>
-    <w:p>
-      <w:pPr>
-        <w:pStyle w:val="ListBullet"/>
-        <w:ind w:left="504" w:hanging="259"/>
-        <w:spacing w:before="0" w:after="100" w:line="264" w:lineRule="auto"/>
-      </w:pPr>
-      <w:r>
-        <w:rPr>
-          <w:rFonts w:ascii="Nanum Gothic" w:hAnsi="Nanum Gothic" w:eastAsia="Nanum Gothic"/>
-          <w:b/>
-          <w:i w:val="0"/>
-          <w:color w:val="000000"/>
-          <w:sz w:val="21"/>
-        </w:rPr>
-        <w:t>시장 확장 대응</w:t>
-      </w:r>
-      <w:r>
-        <w:rPr>
-          <w:rFonts w:ascii="Nanum Gothic" w:hAnsi="Nanum Gothic" w:eastAsia="Nanum Gothic"/>
-          <w:b w:val="0"/>
-          <w:i w:val="0"/>
-          <w:color w:val="000000"/>
-          <w:sz w:val="21"/>
-        </w:rPr>
-        <w:t xml:space="preserve"> — 시장·주기별 분기와 공통 처리부를 나눠 신규 데이터 유형 추가 시 기존 흐름에 미치는 영향을 제한</w:t>
-      </w:r>
-    </w:p>
-    <w:p>
-      <w:pPr>
-        <w:pStyle w:val="ListBullet"/>
-        <w:ind w:left="504" w:hanging="259"/>
-        <w:spacing w:before="0" w:after="100" w:line="264" w:lineRule="auto"/>
-      </w:pPr>
-      <w:r>
-        <w:rPr>
-          <w:rFonts w:ascii="Nanum Gothic" w:hAnsi="Nanum Gothic" w:eastAsia="Nanum Gothic"/>
-          <w:b/>
-          <w:i w:val="0"/>
-          <w:color w:val="000000"/>
-          <w:sz w:val="21"/>
-        </w:rPr>
-        <w:t>안정성 중심 검증</w:t>
-      </w:r>
-      <w:r>
-        <w:rPr>
-          <w:rFonts w:ascii="Nanum Gothic" w:hAnsi="Nanum Gothic" w:eastAsia="Nanum Gothic"/>
-          <w:b w:val="0"/>
-          <w:i w:val="0"/>
-          <w:color w:val="000000"/>
-          <w:sz w:val="21"/>
-        </w:rPr>
-        <w:t xml:space="preserve"> — 조회 결과 정렬, 연속 조회, 실시간 중복 등록, 화면 전환 시 해제 여부를 중심으로 구현·통합 검증</w:t>
-      </w:r>
-    </w:p>
-    <w:p>
-      <w:pPr>
-        <w:pStyle w:val="Heading1"/>
-        <w:keepNext/>
-        <w:pageBreakBefore/>
-      </w:pPr>
-      <w:r>
-        <w:t>3. PowerGraphics Script API 확장 및 개발 문서화</w:t>
-      </w:r>
-    </w:p>
-    <w:p>
-      <w:pPr>
-        <w:keepNext/>
-        <w:spacing w:before="0" w:after="120" w:line="240" w:lineRule="auto"/>
-      </w:pPr>
-      <w:r>
-        <w:rPr>
-          <w:rFonts w:ascii="Nanum Gothic" w:hAnsi="Nanum Gothic" w:eastAsia="Nanum Gothic"/>
-          <w:b/>
-          <w:color w:val="5B6573"/>
-          <w:sz w:val="19"/>
-        </w:rPr>
-        <w:t>기간  2026.07  |  역할  Android Script 인터페이스 구현, 플랫폼 계약 검증, 개발 문서 작성</w:t>
-      </w:r>
-    </w:p>
-    <w:p>
-      <w:pPr>
-        <w:keepNext w:val="0"/>
-        <w:spacing w:before="0" w:after="120" w:line="264" w:lineRule="auto"/>
-      </w:pPr>
-      <w:r>
-        <w:rPr>
-          <w:rFonts w:ascii="Nanum Gothic" w:hAnsi="Nanum Gothic" w:eastAsia="Nanum Gothic"/>
-          <w:b w:val="0"/>
-          <w:i w:val="0"/>
-          <w:color w:val="000000"/>
-          <w:sz w:val="22"/>
-        </w:rPr>
-        <w:t>LS증권 투혼의 화면 Script가 PowerGraphics 기능을 호출할 수 있도록 레거시 호출부와 Android SDK 공개 API 사이의 계약을 확장했습니다. 다른 플랫폼 구현은 참고하되 Android SDK의 실제 지원 범위를 기준으로 구현 가능·보류·미지원 항목을 구분했습니다.</w:t>
-      </w:r>
-    </w:p>
-    <w:p>
-      <w:pPr>
-        <w:pStyle w:val="Heading2"/>
-        <w:keepNext/>
-      </w:pPr>
-      <w:r>
-        <w:t>API 범위 및 계약 검증</w:t>
-      </w:r>
-    </w:p>
-    <w:p>
-      <w:pPr>
-        <w:pStyle w:val="ListBullet"/>
-        <w:ind w:left="504" w:hanging="259"/>
-        <w:spacing w:before="0" w:after="100" w:line="264" w:lineRule="auto"/>
-      </w:pPr>
-      <w:r>
-        <w:rPr>
-          <w:rFonts w:ascii="Nanum Gothic" w:hAnsi="Nanum Gothic" w:eastAsia="Nanum Gothic"/>
-          <w:b/>
-          <w:i w:val="0"/>
-          <w:color w:val="000000"/>
-          <w:sz w:val="21"/>
-        </w:rPr>
-        <w:t>활성 고유 API 64개 → 115개</w:t>
-      </w:r>
-      <w:r>
-        <w:rPr>
-          <w:rFonts w:ascii="Nanum Gothic" w:hAnsi="Nanum Gothic" w:eastAsia="Nanum Gothic"/>
-          <w:b w:val="0"/>
-          <w:i w:val="0"/>
-          <w:color w:val="000000"/>
-          <w:sz w:val="21"/>
-        </w:rPr>
-        <w:t xml:space="preserve"> — 신규 기능과 호환 이름을 정리해 사용 가능 API를 순증 51개 확대</w:t>
-      </w:r>
-    </w:p>
-    <w:p>
-      <w:pPr>
-        <w:pStyle w:val="ListBullet"/>
-        <w:ind w:left="504" w:hanging="259"/>
-        <w:spacing w:before="0" w:after="100" w:line="264" w:lineRule="auto"/>
-      </w:pPr>
-      <w:r>
-        <w:rPr>
-          <w:rFonts w:ascii="Nanum Gothic" w:hAnsi="Nanum Gothic" w:eastAsia="Nanum Gothic"/>
-          <w:b/>
-          <w:i w:val="0"/>
-          <w:color w:val="000000"/>
-          <w:sz w:val="21"/>
-        </w:rPr>
-        <w:t>세부 변경 관리</w:t>
-      </w:r>
-      <w:r>
-        <w:rPr>
-          <w:rFonts w:ascii="Nanum Gothic" w:hAnsi="Nanum Gothic" w:eastAsia="Nanum Gothic"/>
-          <w:b w:val="0"/>
-          <w:i w:val="0"/>
-          <w:color w:val="000000"/>
-          <w:sz w:val="21"/>
-        </w:rPr>
-        <w:t xml:space="preserve"> — 신규 API 64개를 추가하고 기존 호환 이름 13개를 정리하면서 중복 등록과 호출 규약 충돌을 점검</w:t>
-      </w:r>
-    </w:p>
-    <w:p>
-      <w:pPr>
-        <w:pStyle w:val="ListBullet"/>
-        <w:ind w:left="504" w:hanging="259"/>
-        <w:spacing w:before="0" w:after="100" w:line="264" w:lineRule="auto"/>
-      </w:pPr>
-      <w:r>
-        <w:rPr>
-          <w:rFonts w:ascii="Nanum Gothic" w:hAnsi="Nanum Gothic" w:eastAsia="Nanum Gothic"/>
-          <w:b/>
-          <w:i w:val="0"/>
-          <w:color w:val="000000"/>
-          <w:sz w:val="21"/>
-        </w:rPr>
-        <w:t>시그니처 대조</w:t>
-      </w:r>
-      <w:r>
-        <w:rPr>
-          <w:rFonts w:ascii="Nanum Gothic" w:hAnsi="Nanum Gothic" w:eastAsia="Nanum Gothic"/>
-          <w:b w:val="0"/>
-          <w:i w:val="0"/>
-          <w:color w:val="000000"/>
-          <w:sz w:val="21"/>
-        </w:rPr>
-        <w:t xml:space="preserve"> — 함수명, 등록 순서, 반환형, 인자 순서·타입을 공개 구현과 비교해 런타임 호출 실패 가능성을 축소</w:t>
-      </w:r>
-    </w:p>
-    <w:p>
-      <w:pPr>
-        <w:pStyle w:val="ListBullet"/>
-        <w:ind w:left="504" w:hanging="259"/>
-        <w:spacing w:before="0" w:after="100" w:line="264" w:lineRule="auto"/>
-      </w:pPr>
-      <w:r>
-        <w:rPr>
-          <w:rFonts w:ascii="Nanum Gothic" w:hAnsi="Nanum Gothic" w:eastAsia="Nanum Gothic"/>
-          <w:b/>
-          <w:i w:val="0"/>
-          <w:color w:val="000000"/>
-          <w:sz w:val="21"/>
-        </w:rPr>
-        <w:t>기능군 확장</w:t>
-      </w:r>
-      <w:r>
-        <w:rPr>
-          <w:rFonts w:ascii="Nanum Gothic" w:hAnsi="Nanum Gothic" w:eastAsia="Nanum Gothic"/>
-          <w:b w:val="0"/>
-          <w:i w:val="0"/>
-          <w:color w:val="000000"/>
-          <w:sz w:val="21"/>
-        </w:rPr>
-        <w:t xml:space="preserve"> — 차트 유형·축·영역, 조회·실시간 갱신, 지표·비교·시장지표, 기준선·배경·Y축 비율, 화면 이벤트 API를 정리</w:t>
-      </w:r>
-    </w:p>
-    <w:p>
-      <w:pPr>
-        <w:pStyle w:val="ListBullet"/>
-        <w:ind w:left="504" w:hanging="259"/>
-        <w:spacing w:before="0" w:after="100" w:line="264" w:lineRule="auto"/>
-      </w:pPr>
-      <w:r>
-        <w:rPr>
-          <w:rFonts w:ascii="Nanum Gothic" w:hAnsi="Nanum Gothic" w:eastAsia="Nanum Gothic"/>
-          <w:b/>
-          <w:i w:val="0"/>
-          <w:color w:val="000000"/>
-          <w:sz w:val="21"/>
-        </w:rPr>
-        <w:t>지원 범위 구분</w:t>
-      </w:r>
-      <w:r>
-        <w:rPr>
-          <w:rFonts w:ascii="Nanum Gothic" w:hAnsi="Nanum Gothic" w:eastAsia="Nanum Gothic"/>
-          <w:b w:val="0"/>
-          <w:i w:val="0"/>
-          <w:color w:val="000000"/>
-          <w:sz w:val="21"/>
-        </w:rPr>
-        <w:t xml:space="preserve"> — 플랫폼별 공개 인터페이스와 엔진 지원 여부를 분리해 이름만 동일한 기능을 단순 이식하지 않도록 관리</w:t>
-      </w:r>
-    </w:p>
-    <w:p>
-      <w:pPr>
-        <w:pStyle w:val="Heading2"/>
-        <w:keepNext/>
-      </w:pPr>
-      <w:r>
-        <w:t>개발 문서 및 샘플</w:t>
-      </w:r>
-    </w:p>
-    <w:p>
-      <w:pPr>
-        <w:pStyle w:val="ListBullet"/>
-        <w:ind w:left="504" w:hanging="259"/>
-        <w:spacing w:before="0" w:after="100" w:line="264" w:lineRule="auto"/>
-      </w:pPr>
-      <w:r>
-        <w:rPr>
-          <w:rFonts w:ascii="Nanum Gothic" w:hAnsi="Nanum Gothic" w:eastAsia="Nanum Gothic"/>
-          <w:b/>
-          <w:i w:val="0"/>
-          <w:color w:val="000000"/>
-          <w:sz w:val="21"/>
-        </w:rPr>
-        <w:t>180개 메서드 문서</w:t>
-      </w:r>
-      <w:r>
-        <w:rPr>
-          <w:rFonts w:ascii="Nanum Gothic" w:hAnsi="Nanum Gothic" w:eastAsia="Nanum Gothic"/>
-          <w:b w:val="0"/>
-          <w:i w:val="0"/>
-          <w:color w:val="000000"/>
-          <w:sz w:val="21"/>
-        </w:rPr>
-        <w:t xml:space="preserve"> — 기존·현재 시그니처, 기능 설명, 파라미터와 사용 예시를 코드 기준으로 대조·최신화</w:t>
-      </w:r>
-    </w:p>
-    <w:p>
-      <w:pPr>
-        <w:pStyle w:val="ListBullet"/>
-        <w:ind w:left="504" w:hanging="259"/>
-        <w:spacing w:before="0" w:after="100" w:line="264" w:lineRule="auto"/>
-      </w:pPr>
-      <w:r>
-        <w:rPr>
-          <w:rFonts w:ascii="Nanum Gothic" w:hAnsi="Nanum Gothic" w:eastAsia="Nanum Gothic"/>
-          <w:b/>
-          <w:i w:val="0"/>
-          <w:color w:val="000000"/>
-          <w:sz w:val="21"/>
-        </w:rPr>
-        <w:t>43개 Enum 문서</w:t>
-      </w:r>
-      <w:r>
-        <w:rPr>
-          <w:rFonts w:ascii="Nanum Gothic" w:hAnsi="Nanum Gothic" w:eastAsia="Nanum Gothic"/>
-          <w:b w:val="0"/>
-          <w:i w:val="0"/>
-          <w:color w:val="000000"/>
-          <w:sz w:val="21"/>
-        </w:rPr>
-        <w:t xml:space="preserve"> — 허용값과 의미를 정리해 Script 작성자가 문자열·숫자 상수의 의미를 추측하지 않도록 기준 제공</w:t>
-      </w:r>
-    </w:p>
-    <w:p>
-      <w:pPr>
-        <w:pStyle w:val="ListBullet"/>
-        <w:ind w:left="504" w:hanging="259"/>
-        <w:spacing w:before="0" w:after="100" w:line="264" w:lineRule="auto"/>
-      </w:pPr>
-      <w:r>
-        <w:rPr>
-          <w:rFonts w:ascii="Nanum Gothic" w:hAnsi="Nanum Gothic" w:eastAsia="Nanum Gothic"/>
-          <w:b/>
-          <w:i w:val="0"/>
-          <w:color w:val="000000"/>
-          <w:sz w:val="21"/>
-        </w:rPr>
-        <w:t>10종 샘플</w:t>
-      </w:r>
-      <w:r>
-        <w:rPr>
-          <w:rFonts w:ascii="Nanum Gothic" w:hAnsi="Nanum Gothic" w:eastAsia="Nanum Gothic"/>
-          <w:b w:val="0"/>
-          <w:i w:val="0"/>
-          <w:color w:val="000000"/>
-          <w:sz w:val="21"/>
-        </w:rPr>
-        <w:t xml:space="preserve"> — 실시간 데이터, 사용자 캔들, 비교 차트, 사용자·시장지표, 이벤트 표시 등 대표 흐름을 실행 단위로 정리</w:t>
-      </w:r>
-    </w:p>
-    <w:p>
-      <w:pPr>
-        <w:pStyle w:val="Heading2"/>
-        <w:keepNext/>
-      </w:pPr>
-      <w:r>
-        <w:t>통합 검증 및 성과</w:t>
-      </w:r>
-    </w:p>
-    <w:p>
-      <w:pPr>
-        <w:pStyle w:val="ListBullet"/>
-        <w:ind w:left="504" w:hanging="259"/>
-        <w:spacing w:before="0" w:after="100" w:line="264" w:lineRule="auto"/>
-      </w:pPr>
-      <w:r>
-        <w:rPr>
-          <w:rFonts w:ascii="Nanum Gothic" w:hAnsi="Nanum Gothic" w:eastAsia="Nanum Gothic"/>
-          <w:b/>
-          <w:i w:val="0"/>
-          <w:color w:val="000000"/>
-          <w:sz w:val="21"/>
-        </w:rPr>
-        <w:t>멀티모듈 검증</w:t>
-      </w:r>
-      <w:r>
-        <w:rPr>
-          <w:rFonts w:ascii="Nanum Gothic" w:hAnsi="Nanum Gothic" w:eastAsia="Nanum Gothic"/>
-          <w:b w:val="0"/>
-          <w:i w:val="0"/>
-          <w:color w:val="000000"/>
-          <w:sz w:val="21"/>
-        </w:rPr>
-        <w:t xml:space="preserve"> — 앱에서 소스 모듈과 패키징 AAR을 각각 연결해 컴파일·호출 가능 범위와 산출물 교체 절차를 확인</w:t>
-      </w:r>
-    </w:p>
-    <w:p>
-      <w:pPr>
-        <w:pStyle w:val="ListBullet"/>
-        <w:ind w:left="504" w:hanging="259"/>
-        <w:spacing w:before="0" w:after="100" w:line="264" w:lineRule="auto"/>
-      </w:pPr>
-      <w:r>
-        <w:rPr>
-          <w:rFonts w:ascii="Nanum Gothic" w:hAnsi="Nanum Gothic" w:eastAsia="Nanum Gothic"/>
-          <w:b/>
-          <w:i w:val="0"/>
-          <w:color w:val="000000"/>
-          <w:sz w:val="21"/>
-        </w:rPr>
-        <w:t>코드·문서 단일 기준</w:t>
-      </w:r>
-      <w:r>
-        <w:rPr>
-          <w:rFonts w:ascii="Nanum Gothic" w:hAnsi="Nanum Gothic" w:eastAsia="Nanum Gothic"/>
-          <w:b w:val="0"/>
-          <w:i w:val="0"/>
-          <w:color w:val="000000"/>
-          <w:sz w:val="21"/>
-        </w:rPr>
-        <w:t xml:space="preserve"> — 지원 API와 제한사항을 코드와 매뉴얼에서 같은 기준으로 관리해 화면 Script 설계와 인수인계의 불확실성을 축소</w:t>
-      </w:r>
-    </w:p>
-    <w:p>
-      <w:pPr>
-        <w:pStyle w:val="ListBullet"/>
-        <w:ind w:left="504" w:hanging="259"/>
-        <w:spacing w:before="0" w:after="100" w:line="264" w:lineRule="auto"/>
-      </w:pPr>
-      <w:r>
-        <w:rPr>
-          <w:rFonts w:ascii="Nanum Gothic" w:hAnsi="Nanum Gothic" w:eastAsia="Nanum Gothic"/>
-          <w:b/>
-          <w:i w:val="0"/>
-          <w:color w:val="000000"/>
-          <w:sz w:val="21"/>
-        </w:rPr>
-        <w:t>과장 없는 상태 관리</w:t>
-      </w:r>
-      <w:r>
-        <w:rPr>
-          <w:rFonts w:ascii="Nanum Gothic" w:hAnsi="Nanum Gothic" w:eastAsia="Nanum Gothic"/>
-          <w:b w:val="0"/>
-          <w:i w:val="0"/>
-          <w:color w:val="000000"/>
-          <w:sz w:val="21"/>
-        </w:rPr>
-        <w:t xml:space="preserve"> — 개발 환경 검증, 통합 검증, 운영 적용을 구분해 미반영 기능이 배포 완료로 전달되지 않도록 명시</w:t>
-      </w:r>
-    </w:p>
-    <w:p>
-      <w:pPr>
-        <w:pStyle w:val="Heading1"/>
-        <w:keepNext/>
-        <w:pageBreakBefore/>
-      </w:pPr>
-      <w:r>
-        <w:t>4. PowerGraphics 운영 유지보수 및 고객사 대응</w:t>
+        <w:t>2. PowerGraphics 운영 유지보수 및 고객사 대응</w:t>
       </w:r>
     </w:p>
     <w:p>
@@ -1835,7 +1051,7 @@
         <w:pageBreakBefore/>
       </w:pPr>
       <w:r>
-        <w:t>5. MarketMap·거래기록 기능</w:t>
+        <w:t>3. MarketMap·거래기록 기능</w:t>
       </w:r>
     </w:p>
     <w:p>
@@ -1941,7 +1157,7 @@
         <w:pageBreakBefore w:val="0"/>
       </w:pPr>
       <w:r>
-        <w:t>6. 회사 웹 홈페이지 리팩토링</w:t>
+        <w:t>4. 회사 웹 홈페이지 리팩토링</w:t>
       </w:r>
     </w:p>
     <w:p>
@@ -2160,88 +1376,7 @@
         <w:keepNext/>
       </w:pPr>
       <w:r>
-        <w:t>Case 1. 시장·주기별 조회와 실시간 데이터 생명주기 관리</w:t>
-      </w:r>
-    </w:p>
-    <w:p>
-      <w:pPr>
-        <w:keepNext/>
-        <w:spacing w:before="0" w:after="120" w:line="240" w:lineRule="auto"/>
-      </w:pPr>
-      <w:r>
-        <w:rPr>
-          <w:rFonts w:ascii="Nanum Gothic" w:hAnsi="Nanum Gothic" w:eastAsia="Nanum Gothic"/>
-          <w:b/>
-          <w:color w:val="5B6573"/>
-          <w:sz w:val="19"/>
-        </w:rPr>
-        <w:t xml:space="preserve">문제  </w:t>
-      </w:r>
-      <w:r>
-        <w:rPr>
-          <w:rFonts w:ascii="Nanum Gothic" w:hAnsi="Nanum Gothic" w:eastAsia="Nanum Gothic"/>
-          <w:b/>
-          <w:color w:val="5B6573"/>
-          <w:sz w:val="19"/>
-        </w:rPr>
-        <w:t>시장·주기별 조회 방식과 실시간 데이터 유형이 달라 화면 전환 시 중복 구독, 이전 응답 혼입, 연속 조회 단절 위험이 있었습니다.</w:t>
-      </w:r>
-    </w:p>
-    <w:p>
-      <w:pPr>
-        <w:keepNext/>
-        <w:spacing w:before="0" w:after="120" w:line="240" w:lineRule="auto"/>
-      </w:pPr>
-      <w:r>
-        <w:rPr>
-          <w:rFonts w:ascii="Nanum Gothic" w:hAnsi="Nanum Gothic" w:eastAsia="Nanum Gothic"/>
-          <w:b/>
-          <w:color w:val="5B6573"/>
-          <w:sz w:val="19"/>
-        </w:rPr>
-        <w:t xml:space="preserve">접근  </w:t>
-      </w:r>
-      <w:r>
-        <w:rPr>
-          <w:rFonts w:ascii="Nanum Gothic" w:hAnsi="Nanum Gothic" w:eastAsia="Nanum Gothic"/>
-          <w:b/>
-          <w:color w:val="5B6573"/>
-          <w:sz w:val="19"/>
-        </w:rPr>
-        <w:t>요청 큐, 화면·응답 식별자 매핑, 연속 키, 메인·추가·겹침 조회를 분리하고 종목·주기 변경과 종료 시 취소·버퍼 초기화·실시간 해제를 한 흐름으로 정리했습니다.</w:t>
-      </w:r>
-    </w:p>
-    <w:p>
-      <w:pPr>
-        <w:keepNext/>
-        <w:spacing w:before="0" w:after="120" w:line="240" w:lineRule="auto"/>
-      </w:pPr>
-      <w:r>
-        <w:rPr>
-          <w:rFonts w:ascii="Nanum Gothic" w:hAnsi="Nanum Gothic" w:eastAsia="Nanum Gothic"/>
-          <w:b/>
-          <w:color w:val="5B6573"/>
-          <w:sz w:val="19"/>
-        </w:rPr>
-        <w:t xml:space="preserve">결과  </w:t>
-      </w:r>
-      <w:r>
-        <w:rPr>
-          <w:rFonts w:ascii="Nanum Gothic" w:hAnsi="Nanum Gothic" w:eastAsia="Nanum Gothic"/>
-          <w:b/>
-          <w:color w:val="5B6573"/>
-          <w:sz w:val="19"/>
-        </w:rPr>
-        <w:t>조회 61종과 실시간 21종의 처리 단계를 공통 생명주기로 관리해 오류 위치를 좁히고 시장 확장 시 영향 범위를 제한했습니다.</w:t>
-      </w:r>
-    </w:p>
-    <w:p>
-      <w:pPr>
-        <w:pStyle w:val="Heading2"/>
-        <w:keepNext/>
-      </w:pPr>
-      <w:r>
-        <w:t>Case 2. 레거시 데이터 형식과 동적 지표 설정의 불일치</w:t>
+        <w:t>Case 1. 레거시 데이터 형식과 동적 지표 설정의 불일치</w:t>
       </w:r>
     </w:p>
     <w:p>
@@ -2322,7 +1457,7 @@
         <w:keepNext/>
       </w:pPr>
       <w:r>
-        <w:t>Case 3. 재사용 UI의 이벤트 리스너와 상태 회귀</w:t>
+        <w:t>Case 2. 재사용 UI의 이벤트 리스너와 상태 회귀</w:t>
       </w:r>
     </w:p>
     <w:p>
@@ -2395,87 +1530,6 @@
           <w:sz w:val="19"/>
         </w:rPr>
         <w:t>스크롤·재진입·초기화·색상 변경을 연속 수행해도 화면과 저장값이 일치하고 같은 패턴의 회귀를 공통 방식으로 수정할 수 있게 됐습니다.</w:t>
-      </w:r>
-    </w:p>
-    <w:p>
-      <w:pPr>
-        <w:pStyle w:val="Heading2"/>
-        <w:keepNext/>
-      </w:pPr>
-      <w:r>
-        <w:t>Case 4. 플랫폼별 Script API 계약과 지원 범위 차이</w:t>
-      </w:r>
-    </w:p>
-    <w:p>
-      <w:pPr>
-        <w:keepNext/>
-        <w:spacing w:before="0" w:after="120" w:line="240" w:lineRule="auto"/>
-      </w:pPr>
-      <w:r>
-        <w:rPr>
-          <w:rFonts w:ascii="Nanum Gothic" w:hAnsi="Nanum Gothic" w:eastAsia="Nanum Gothic"/>
-          <w:b/>
-          <w:color w:val="5B6573"/>
-          <w:sz w:val="19"/>
-        </w:rPr>
-        <w:t xml:space="preserve">문제  </w:t>
-      </w:r>
-      <w:r>
-        <w:rPr>
-          <w:rFonts w:ascii="Nanum Gothic" w:hAnsi="Nanum Gothic" w:eastAsia="Nanum Gothic"/>
-          <w:b/>
-          <w:color w:val="5B6573"/>
-          <w:sz w:val="19"/>
-        </w:rPr>
-        <w:t>동일한 기능명도 플랫폼별 등록 시그니처, 반환형, 인자 순서와 실제 SDK 지원 여부가 달라 단순 이식 시 런타임 실패 위험이 있었습니다.</w:t>
-      </w:r>
-    </w:p>
-    <w:p>
-      <w:pPr>
-        <w:keepNext/>
-        <w:spacing w:before="0" w:after="120" w:line="240" w:lineRule="auto"/>
-      </w:pPr>
-      <w:r>
-        <w:rPr>
-          <w:rFonts w:ascii="Nanum Gothic" w:hAnsi="Nanum Gothic" w:eastAsia="Nanum Gothic"/>
-          <w:b/>
-          <w:color w:val="5B6573"/>
-          <w:sz w:val="19"/>
-        </w:rPr>
-        <w:t xml:space="preserve">접근  </w:t>
-      </w:r>
-      <w:r>
-        <w:rPr>
-          <w:rFonts w:ascii="Nanum Gothic" w:hAnsi="Nanum Gothic" w:eastAsia="Nanum Gothic"/>
-          <w:b/>
-          <w:color w:val="5B6573"/>
-          <w:sz w:val="19"/>
-        </w:rPr>
-        <w:t>등록 정의와 구현 메서드를 순서대로 대조하고 지원·보류·미지원 항목을 구분했습니다. 같은 기준을 180개 메서드 문서와 샘플에 반영했습니다.</w:t>
-      </w:r>
-    </w:p>
-    <w:p>
-      <w:pPr>
-        <w:keepNext/>
-        <w:spacing w:before="0" w:after="120" w:line="240" w:lineRule="auto"/>
-      </w:pPr>
-      <w:r>
-        <w:rPr>
-          <w:rFonts w:ascii="Nanum Gothic" w:hAnsi="Nanum Gothic" w:eastAsia="Nanum Gothic"/>
-          <w:b/>
-          <w:color w:val="5B6573"/>
-          <w:sz w:val="19"/>
-        </w:rPr>
-        <w:t xml:space="preserve">결과  </w:t>
-      </w:r>
-      <w:r>
-        <w:rPr>
-          <w:rFonts w:ascii="Nanum Gothic" w:hAnsi="Nanum Gothic" w:eastAsia="Nanum Gothic"/>
-          <w:b/>
-          <w:color w:val="5B6573"/>
-          <w:sz w:val="19"/>
-        </w:rPr>
-        <w:t>활성 API를 64개에서 115개로 확장하면서 사용 가능 범위와 운영 적용 전 확인 항목을 코드·문서에서 함께 검증할 수 있게 했습니다.</w:t>
       </w:r>
     </w:p>
     <w:p>

</xml_diff>

<commit_message>
docs: add MarketMap experience and fit resume into two pages
</commit_message>
<xml_diff>
--- a/career-document/오인성_경력기술서.docx
+++ b/career-document/오인성_경력기술서.docx
@@ -18,7 +18,7 @@
           <w:color w:val="2E74B5"/>
           <w:sz w:val="19"/>
         </w:rPr>
-        <w:t>ANDROID DEVELOPER · ENTERPRISE SYSTEM INTEGRATION</w:t>
+        <w:t>ANDROID DEVELOPER / ENTERPRISE SYSTEM INTEGRATION</w:t>
       </w:r>
     </w:p>
     <w:p>
@@ -45,7 +45,7 @@
           <w:color w:val="5B6573"/>
           <w:sz w:val="27"/>
         </w:rPr>
-        <w:t>금융 도메인 경험을 보유한 엔터프라이즈 Android·시스템 연동 개발자</w:t>
+        <w:t>금융 도메인 경험을 보유한 엔터프라이즈 Android, 시스템 연동 개발자</w:t>
       </w:r>
     </w:p>
     <w:p>
@@ -89,7 +89,7 @@
           <w:color w:val="000000"/>
           <w:sz w:val="21"/>
         </w:rPr>
-        <w:t>(주)차트연구소 · 모바일개발부 · 연구원/정규직</w:t>
+        <w:t>(주)차트연구소 / 모바일개발부 / 연구원/정규직</w:t>
       </w:r>
     </w:p>
     <w:p>
@@ -221,7 +221,7 @@
           <w:color w:val="000000"/>
           <w:sz w:val="22"/>
         </w:rPr>
-        <w:t>모바일개발부 연구원으로서 PowerGraphics Android 애플리케이션·차트 SDK 개발과 유지보수, EasyChart 화면·컨트롤 개발을 담당했습니다. 정확성과 안정성이 중요한 금융 시스템에서 화면 상태와 엔진 속성, 운영 버전의 정합성을 함께 관리했습니다.</w:t>
+        <w:t>모바일개발부 연구원으로서 PowerGraphics Android 애플리케이션, 차트 SDK 개발과 유지보수, EasyChart 화면, 컨트롤 개발을 담당했습니다. 정확성과 안정성이 중요한 금융 시스템에서 화면 상태와 엔진 속성, 운영 버전의 정합성을 함께 관리했습니다.</w:t>
       </w:r>
     </w:p>
     <w:p>
@@ -247,7 +247,7 @@
           <w:color w:val="000000"/>
           <w:sz w:val="21"/>
         </w:rPr>
-        <w:t>Android 애플리케이션·SDK 개발 및 유지보수</w:t>
+        <w:t>Android 애플리케이션, SDK 개발 및 유지보수</w:t>
       </w:r>
       <w:r>
         <w:rPr>
@@ -257,7 +257,7 @@
           <w:color w:val="000000"/>
           <w:sz w:val="21"/>
         </w:rPr>
-        <w:t xml:space="preserve"> — Kotlin·Java 기반 신규 화면, 재사용 컨트롤, 차트 SDK 기능을 설계하고 운영 이슈를 안정화</w:t>
+        <w:t xml:space="preserve"> — Kotlin, Java 기반 신규 화면, 재사용 컨트롤, 차트 SDK 기능을 설계하고 운영 이슈를 안정화</w:t>
       </w:r>
     </w:p>
     <w:p>
@@ -274,7 +274,7 @@
           <w:color w:val="000000"/>
           <w:sz w:val="21"/>
         </w:rPr>
-        <w:t>요구사항 분석·변경 영향 추적·릴리스 대응</w:t>
+        <w:t>요구사항 분석, 변경 영향 추적, 릴리스 대응</w:t>
       </w:r>
       <w:r>
         <w:rPr>
@@ -301,7 +301,7 @@
           <w:color w:val="000000"/>
           <w:sz w:val="21"/>
         </w:rPr>
-        <w:t>개발 문서·운영 가이드와 이해관계자 소통</w:t>
+        <w:t>개발 문서, 운영 가이드와 이해관계자 소통</w:t>
       </w:r>
       <w:r>
         <w:rPr>
@@ -311,7 +311,7 @@
           <w:color w:val="000000"/>
           <w:sz w:val="21"/>
         </w:rPr>
-        <w:t xml:space="preserve"> — API 계약, 샘플, 배포·설정 절차를 문서화하고 고객사와 내부 담당자의 검증 기준을 정렬</w:t>
+        <w:t xml:space="preserve"> — API 계약, 샘플, 배포, 설정 절차를 문서화하고 고객사와 내부 담당자의 검증 기준을 정렬</w:t>
       </w:r>
     </w:p>
     <w:p>
@@ -321,7 +321,7 @@
         <w:pageBreakBefore/>
       </w:pPr>
       <w:r>
-        <w:t>1. PowerGraphics Android·EasyChart 개발</w:t>
+        <w:t>1. PowerGraphics Android, EasyChart 개발</w:t>
       </w:r>
     </w:p>
     <w:p>
@@ -336,7 +336,7 @@
           <w:color w:val="5B6573"/>
           <w:sz w:val="19"/>
         </w:rPr>
-        <w:t>기간  2026.03 ~ 2026.07  |  역할  Android 화면·컨트롤 설계, 상태 관리, 엔진 연동</w:t>
+        <w:t>기간  2026.03 ~ 2026.07  |  역할  Android 화면, 컨트롤 설계, 상태 관리, 엔진 연동</w:t>
       </w:r>
     </w:p>
     <w:p>
@@ -352,7 +352,7 @@
           <w:color w:val="000000"/>
           <w:sz w:val="22"/>
         </w:rPr>
-        <w:t>PowerGraphics 종합 차트 엔진을 기반으로 모바일 사용자가 종목·주기·차트 유형·기술적 지표를 빠르게 조작하는 EasyChart를 개발했습니다. 기존 엔진과 제어 계층의 계약을 유지하면서 Kotlin UI와 ViewModel을 분리하고 설정 변경이 메인 차트까지 일관되게 반영되도록 구성했습니다.</w:t>
+        <w:t>PowerGraphics 종합 차트 엔진을 기반으로 모바일 사용자가 종목, 주기, 차트 유형, 기술적 지표를 빠르게 조작하는 EasyChart를 개발했습니다. 기존 엔진과 제어 계층의 계약을 유지하면서 Kotlin UI와 ViewModel을 분리하고 설정 변경이 메인 차트까지 일관되게 반영되도록 구성했습니다.</w:t>
       </w:r>
     </w:p>
     <w:p>
@@ -415,7 +415,7 @@
           <w:color w:val="000000"/>
           <w:sz w:val="21"/>
         </w:rPr>
-        <w:t xml:space="preserve"> — 라인·캔들·영역·바 차트와 종목, 분/틱·일/주/월/년 주기 변경을 데이터 요청과 엔진 속성에 연결</w:t>
+        <w:t xml:space="preserve"> — 라인, 캔들, 영역, 바 차트와 종목, 분/틱, 일/주/월/년 주기 변경을 데이터 요청과 엔진 속성에 연결</w:t>
       </w:r>
     </w:p>
     <w:p>
@@ -442,7 +442,7 @@
           <w:color w:val="000000"/>
           <w:sz w:val="21"/>
         </w:rPr>
-        <w:t xml:space="preserve"> — LiveData·StateFlow로 종목, 현재가, 차트 유형, 지표 목록, 다크모드를 관리하고 화면 생명주기와 분리</w:t>
+        <w:t xml:space="preserve"> — LiveData, StateFlow로 종목, 현재가, 차트 유형, 지표 목록, 다크모드를 관리하고 화면 생명주기와 분리</w:t>
       </w:r>
     </w:p>
     <w:p>
@@ -469,7 +469,7 @@
           <w:color w:val="000000"/>
           <w:sz w:val="21"/>
         </w:rPr>
-        <w:t xml:space="preserve"> — 차트 유형·주기 선택, 색상·굵기·선 스타일, 하단바와 상세설정 목록을 공용 UI 패턴으로 구현</w:t>
+        <w:t xml:space="preserve"> — 차트 유형, 주기 선택, 색상, 굵기, 선 스타일, 하단바와 상세설정 목록을 공용 UI 패턴으로 구현</w:t>
       </w:r>
     </w:p>
     <w:p>
@@ -532,7 +532,7 @@
           <w:color w:val="000000"/>
           <w:sz w:val="21"/>
         </w:rPr>
-        <w:t xml:space="preserve"> — 공백·특수문자 차이를 정규화하고 별칭·부분 일치 규칙을 적용해 지표명과 엔진 파라미터의 불일치를 흡수</w:t>
+        <w:t xml:space="preserve"> — 공백, 특수문자 차이를 정규화하고 별칭, 부분 일치 규칙을 적용해 지표명과 엔진 파라미터의 불일치를 흡수</w:t>
       </w:r>
     </w:p>
     <w:p>
@@ -559,7 +559,7 @@
           <w:color w:val="000000"/>
           <w:sz w:val="21"/>
         </w:rPr>
-        <w:t xml:space="preserve"> — 기간·배수·시간·비율 등 파라미터 의미에 따라 입력 방식과 허용 범위를 다르게 적용하고 범위 밖 값을 차단</w:t>
+        <w:t xml:space="preserve"> — 기간, 배수, 시간, 비율 등 파라미터 의미에 따라 입력 방식과 허용 범위를 다르게 적용하고 범위 밖 값을 차단</w:t>
       </w:r>
     </w:p>
     <w:p>
@@ -586,7 +586,7 @@
           <w:color w:val="000000"/>
           <w:sz w:val="21"/>
         </w:rPr>
-        <w:t xml:space="preserve"> — 변경·저장·초기화·재진입 시 값 복원, 기본값 덮어쓰기 방지, 가격·거래량 이동평균과 지표 스타일을 일관되게 관리</w:t>
+        <w:t xml:space="preserve"> — 변경, 저장, 초기화, 재진입 시 값 복원, 기본값 덮어쓰기 방지, 가격, 거래량 이동평균과 지표 스타일을 일관되게 관리</w:t>
       </w:r>
     </w:p>
     <w:p>
@@ -612,7 +612,7 @@
           <w:color w:val="000000"/>
           <w:sz w:val="21"/>
         </w:rPr>
-        <w:t>UI·ViewModel·엔진 동기화</w:t>
+        <w:t>UI, ViewModel, 엔진 동기화</w:t>
       </w:r>
       <w:r>
         <w:rPr>
@@ -622,7 +622,7 @@
           <w:color w:val="000000"/>
           <w:sz w:val="21"/>
         </w:rPr>
-        <w:t xml:space="preserve"> — 선택값, 임시 편집 상태, 저장 상태와 엔진 속성의 책임을 분리해 재진입·초기화 회귀의 원인을 추적할 수 있는 구조 확보</w:t>
+        <w:t xml:space="preserve"> — 선택값, 임시 편집 상태, 저장 상태와 엔진 속성의 책임을 분리해 재진입, 초기화 회귀의 원인을 추적할 수 있는 구조 확보</w:t>
       </w:r>
     </w:p>
     <w:p>
@@ -649,7 +649,7 @@
           <w:color w:val="000000"/>
           <w:sz w:val="21"/>
         </w:rPr>
-        <w:t xml:space="preserve"> — 종목·시장·주기 조합을 검증하고 조회 모드, 엔진 콜백, 현재가와 화면 갱신 순서를 단일 흐름으로 정리</w:t>
+        <w:t xml:space="preserve"> — 종목, 시장, 주기 조합을 검증하고 조회 모드, 엔진 콜백, 현재가와 화면 갱신 순서를 단일 흐름으로 정리</w:t>
       </w:r>
     </w:p>
     <w:p>
@@ -676,7 +676,7 @@
           <w:color w:val="000000"/>
           <w:sz w:val="21"/>
         </w:rPr>
-        <w:t xml:space="preserve"> — 기능 노출, 아이콘·간격, 입력 규칙과 도움말 변경을 기능 단위로 반영할 수 있도록 화면 책임을 구조화</w:t>
+        <w:t xml:space="preserve"> — 기능 노출, 아이콘, 간격, 입력 규칙과 도움말 변경을 기능 단위로 반영할 수 있도록 화면 책임을 구조화</w:t>
       </w:r>
     </w:p>
     <w:p>
@@ -701,7 +701,7 @@
           <w:color w:val="5B6573"/>
           <w:sz w:val="19"/>
         </w:rPr>
-        <w:t>기간  2026.03 ~ 현재  |  역할  오류 재현, 회귀 수정, 다중 운영 버전·릴리스 대응</w:t>
+        <w:t>기간  2026.03 ~ 현재  |  역할  오류 재현, 회귀 수정, 다중 운영 버전, 릴리스 대응</w:t>
       </w:r>
     </w:p>
     <w:p>
@@ -780,7 +780,7 @@
           <w:color w:val="000000"/>
           <w:sz w:val="21"/>
         </w:rPr>
-        <w:t xml:space="preserve"> — 24개 시간대 표기 항목의 오기를 일괄 점검·수정해 사용자에게 노출되는 기준 시간을 통일</w:t>
+        <w:t xml:space="preserve"> — 24개 시간대 표기 항목의 오기를 일괄 점검, 수정해 사용자에게 노출되는 기준 시간을 통일</w:t>
       </w:r>
     </w:p>
     <w:p>
@@ -807,7 +807,7 @@
           <w:color w:val="000000"/>
           <w:sz w:val="21"/>
         </w:rPr>
-        <w:t xml:space="preserve"> — 주문 설정 수량의 최소·최대 범위가 동일하게 적용된 문제를 수정하고 입력창·슬라이더·라벨의 허용 범위를 함께 동기화</w:t>
+        <w:t xml:space="preserve"> — 주문 설정 수량의 최소, 최대 범위가 동일하게 적용된 문제를 수정하고 입력창, 슬라이더, 라벨의 허용 범위를 함께 동기화</w:t>
       </w:r>
     </w:p>
     <w:p>
@@ -834,7 +834,7 @@
           <w:color w:val="000000"/>
           <w:sz w:val="21"/>
         </w:rPr>
-        <w:t xml:space="preserve"> — 재바인딩 시 기존 이벤트 리스너를 먼저 해제한 뒤 값을 설정해 초기화·색상 변경이 체크 상태와 입력값을 되돌리는 회귀를 방지</w:t>
+        <w:t xml:space="preserve"> — 재바인딩 시 기존 이벤트 리스너를 먼저 해제한 뒤 값을 설정해 초기화, 색상 변경이 체크 상태와 입력값을 되돌리는 회귀를 방지</w:t>
       </w:r>
     </w:p>
     <w:p>
@@ -851,7 +851,7 @@
           <w:color w:val="000000"/>
           <w:sz w:val="21"/>
         </w:rPr>
-        <w:t>동적 지표·색상 회귀</w:t>
+        <w:t>동적 지표, 색상 회귀</w:t>
       </w:r>
       <w:r>
         <w:rPr>
@@ -861,7 +861,7 @@
           <w:color w:val="000000"/>
           <w:sz w:val="21"/>
         </w:rPr>
-        <w:t xml:space="preserve"> — 추가 설정 행의 위치와 엔진 파라미터 순서를 보정하고 지표 초기화, 이동평균 유형, 색상·선 스타일 저장 경로를 함께 검증</w:t>
+        <w:t xml:space="preserve"> — 추가 설정 행의 위치와 엔진 파라미터 순서를 보정하고 지표 초기화, 이동평균 유형, 색상, 선 스타일 저장 경로를 함께 검증</w:t>
       </w:r>
     </w:p>
     <w:p>
@@ -888,7 +888,7 @@
           <w:color w:val="000000"/>
           <w:sz w:val="21"/>
         </w:rPr>
-        <w:t xml:space="preserve"> — 글자·폭을 조정하고 상승·하락 색상을 고정값이 아닌 현재 캔들 속성에서 읽어 테마·고객 설정과 일치</w:t>
+        <w:t xml:space="preserve"> — 글자, 폭을 조정하고 상승, 하락 색상을 고정값이 아닌 현재 캔들 속성에서 읽어 테마, 고객 설정과 일치</w:t>
       </w:r>
     </w:p>
     <w:p>
@@ -914,7 +914,7 @@
           <w:color w:val="000000"/>
           <w:sz w:val="21"/>
         </w:rPr>
-        <w:t>기능 노출·원복 관리</w:t>
+        <w:t>기능 노출, 원복 관리</w:t>
       </w:r>
       <w:r>
         <w:rPr>
@@ -924,7 +924,7 @@
           <w:color w:val="000000"/>
           <w:sz w:val="21"/>
         </w:rPr>
-        <w:t xml:space="preserve"> — 운영 버전별 메뉴·옵션 노출 조건과 변경 이력을 구분하고 요구 변경 시 영향 영역과 원복 경로를 확보</w:t>
+        <w:t xml:space="preserve"> — 운영 버전별 메뉴, 옵션 노출 조건과 변경 이력을 구분하고 요구 변경 시 영향 영역과 원복 경로를 확보</w:t>
       </w:r>
     </w:p>
     <w:p>
@@ -1041,7 +1041,7 @@
           <w:color w:val="000000"/>
           <w:sz w:val="21"/>
         </w:rPr>
-        <w:t xml:space="preserve"> — 정상·오류 경로, 기대 결과, 적용 범위와 제한사항을 기능 단위로 정리해 고객사·내부 담당자에게 공유</w:t>
+        <w:t xml:space="preserve"> — 정상, 오류 경로, 기대 결과, 적용 범위와 제한사항을 기능 단위로 정리해 고객사, 내부 담당자에게 공유</w:t>
       </w:r>
     </w:p>
     <w:p>
@@ -1051,7 +1051,7 @@
         <w:pageBreakBefore/>
       </w:pPr>
       <w:r>
-        <w:t>3. MarketMap·거래기록 기능</w:t>
+        <w:t>3. MarketMap, 거래기록 기능</w:t>
       </w:r>
     </w:p>
     <w:p>
@@ -1093,7 +1093,7 @@
           <w:color w:val="000000"/>
           <w:sz w:val="21"/>
         </w:rPr>
-        <w:t xml:space="preserve"> — D-1/D-2 데이터 깊이, 카테고리, 선택·타이틀 표시, 깊이별·선택 테두리의 굵기와 색상을 편집하는 화면 구현</w:t>
+        <w:t xml:space="preserve"> — D-1/D-2 데이터 깊이, 카테고리, 선택, 타이틀 표시, 깊이별, 선택 테두리의 굵기와 색상을 편집하는 화면 구현</w:t>
       </w:r>
     </w:p>
     <w:p>
@@ -1120,7 +1120,7 @@
           <w:color w:val="000000"/>
           <w:sz w:val="21"/>
         </w:rPr>
-        <w:t xml:space="preserve"> — 깊이 전환 전 현재 값을 보존하고 배열 범위를 검증하며 저장·초기화·재조회·속성 적용 순서를 정리</w:t>
+        <w:t xml:space="preserve"> — 깊이 전환 전 현재 값을 보존하고 배열 범위를 검증하며 저장, 초기화, 재조회, 속성 적용 순서를 정리</w:t>
       </w:r>
     </w:p>
     <w:p>
@@ -1147,7 +1147,7 @@
           <w:color w:val="000000"/>
           <w:sz w:val="21"/>
         </w:rPr>
-        <w:t xml:space="preserve"> — 매수·매도와 가상·실제·전체 거래 유형을 차트에 표시하는 샘플 흐름을 구현해 엔진 연동을 검증</w:t>
+        <w:t xml:space="preserve"> — 매수, 매도와 가상, 실제, 전체 거래 유형을 차트에 표시하는 샘플 흐름을 구현해 엔진 연동을 검증</w:t>
       </w:r>
     </w:p>
     <w:p>
@@ -1188,7 +1188,7 @@
           <w:color w:val="000000"/>
           <w:sz w:val="22"/>
         </w:rPr>
-        <w:t>회사·제품 정보를 고객이 쉽게 탐색하고 운영자가 공지와 문의를 관리할 수 있도록 React 기반 홈페이지를 리팩토링했습니다. 반응형 화면, 콘텐츠 운영, 외부 지도와 문의 접수, 배포 설정을 하나의 운영 흐름으로 정리했습니다.</w:t>
+        <w:t>회사, 제품 정보를 고객이 쉽게 탐색하고 운영자가 공지와 문의를 관리할 수 있도록 React 기반 홈페이지를 리팩토링했습니다. 반응형 화면, 콘텐츠 운영, 외부 지도와 문의 접수, 배포 설정을 하나의 운영 흐름으로 정리했습니다.</w:t>
       </w:r>
     </w:p>
     <w:p>
@@ -1224,7 +1224,7 @@
           <w:color w:val="000000"/>
           <w:sz w:val="21"/>
         </w:rPr>
-        <w:t xml:space="preserve"> — 메인, 회사 소개·연혁·오시는 길, 제품 2종, 포트폴리오, 공지 목록·상세, 문의 화면과 공통 Header/Footer 구현</w:t>
+        <w:t xml:space="preserve"> — 메인, 회사 소개, 연혁, 오시는 길, 제품 2종, 포트폴리오, 공지 목록, 상세, 문의 화면과 공통 Header/Footer 구현</w:t>
       </w:r>
     </w:p>
     <w:p>
@@ -1251,7 +1251,7 @@
           <w:color w:val="000000"/>
           <w:sz w:val="21"/>
         </w:rPr>
-        <w:t xml:space="preserve"> — React·Vite·SCSS 기반으로 공통 컴포넌트, 레이아웃, 페이지, 라우트, API와 스타일 책임을 분리</w:t>
+        <w:t xml:space="preserve"> — React, Vite, SCSS 기반으로 공통 컴포넌트, 레이아웃, 페이지, 라우트, API와 스타일 책임을 분리</w:t>
       </w:r>
     </w:p>
     <w:p>
@@ -1278,7 +1278,7 @@
           <w:color w:val="000000"/>
           <w:sz w:val="21"/>
         </w:rPr>
-        <w:t xml:space="preserve"> — 고정·일반 게시물, 목록·상세, 첨부, 로딩 제한과 오류 상태를 처리하고 운영 데이터의 이미지·스타일 편차를 보정</w:t>
+        <w:t xml:space="preserve"> — 고정, 일반 게시물, 목록, 상세, 첨부, 로딩 제한과 오류 상태를 처리하고 운영 데이터의 이미지, 스타일 편차를 보정</w:t>
       </w:r>
     </w:p>
     <w:p>
@@ -1295,7 +1295,7 @@
           <w:color w:val="000000"/>
           <w:sz w:val="21"/>
         </w:rPr>
-        <w:t>지도·문의 연동</w:t>
+        <w:t>지도, 문의 연동</w:t>
       </w:r>
       <w:r>
         <w:rPr>
@@ -1305,7 +1305,7 @@
           <w:color w:val="000000"/>
           <w:sz w:val="21"/>
         </w:rPr>
-        <w:t xml:space="preserve"> — 지도 서비스를 연결하고 문의 첨부를 최대 5개·총 10MB로 제한하며 자동화 방지와 중복 제출 방어를 적용</w:t>
+        <w:t xml:space="preserve"> — 지도 서비스를 연결하고 문의 첨부를 최대 5개, 총 10MB로 제한하며 자동화 방지와 중복 제출 방어를 적용</w:t>
       </w:r>
     </w:p>
     <w:p>
@@ -1322,7 +1322,7 @@
           <w:color w:val="000000"/>
           <w:sz w:val="21"/>
         </w:rPr>
-        <w:t>배포·운영 가이드</w:t>
+        <w:t>배포, 운영 가이드</w:t>
       </w:r>
       <w:r>
         <w:rPr>
@@ -1332,7 +1332,7 @@
           <w:color w:val="000000"/>
           <w:sz w:val="21"/>
         </w:rPr>
-        <w:t xml:space="preserve"> — 라우팅·정적 리소스·외부 서비스 설정, CMS와 문의 흐름의 운영 절차를 문서화해 재설정·인수인계 기준 마련</w:t>
+        <w:t xml:space="preserve"> — 라우팅, 정적 리소스, 외부 서비스 설정, CMS와 문의 흐름의 운영 절차를 문서화해 재설정, 인수인계 기준 마련</w:t>
       </w:r>
     </w:p>
     <w:p>
@@ -1357,7 +1357,7 @@
           <w:color w:val="000000"/>
           <w:sz w:val="22"/>
         </w:rPr>
-        <w:t>제품 소개, 공지 운영, 지도 안내와 문의 접수를 반응형 웹 구조로 통합하고 로컬·운영 환경 차이에서 발생하는 경로·리소스 문제를 재현해 수정했습니다.</w:t>
+        <w:t>제품 소개, 공지 운영, 지도 안내와 문의 접수를 반응형 웹 구조로 통합하고 로컬, 운영 환경 차이에서 발생하는 경로, 리소스 문제를 재현해 수정했습니다.</w:t>
       </w:r>
     </w:p>
     <w:p>
@@ -1424,7 +1424,7 @@
           <w:color w:val="5B6573"/>
           <w:sz w:val="19"/>
         </w:rPr>
-        <w:t>UTF-8 우선·EUC-KR 대체 해석, 이름 정규화·별칭 매핑, 파라미터 의미별 입력 검증을 적용하고 추가 행과 엔진 인덱스를 명시적으로 연결했습니다.</w:t>
+        <w:t>UTF-8 우선, EUC-KR 대체 해석, 이름 정규화, 별칭 매핑, 파라미터 의미별 입력 검증을 적용하고 추가 행과 엔진 인덱스를 명시적으로 연결했습니다.</w:t>
       </w:r>
     </w:p>
     <w:p>
@@ -1448,7 +1448,7 @@
           <w:color w:val="5B6573"/>
           <w:sz w:val="19"/>
         </w:rPr>
-        <w:t>한글 지표 정의를 호환하면서 의도한 기간·유형·색상 값이 저장·초기화·재진입에도 동일하게 유지되도록 정합성을 높였습니다.</w:t>
+        <w:t>한글 지표 정의를 호환하면서 의도한 기간, 유형, 색상 값이 저장, 초기화, 재진입에도 동일하게 유지되도록 정합성을 높였습니다.</w:t>
       </w:r>
     </w:p>
     <w:p>
@@ -1481,7 +1481,7 @@
           <w:color w:val="5B6573"/>
           <w:sz w:val="19"/>
         </w:rPr>
-        <w:t>RecyclerView가 설정 행을 재사용할 때 값 설정 과정에서 이전 리스너가 실행되어 초기화나 색상 변경이 체크 상태·입력값을 되돌렸습니다.</w:t>
+        <w:t>RecyclerView가 설정 행을 재사용할 때 값 설정 과정에서 이전 리스너가 실행되어 초기화나 색상 변경이 체크 상태, 입력값을 되돌렸습니다.</w:t>
       </w:r>
     </w:p>
     <w:p>
@@ -1529,7 +1529,7 @@
           <w:color w:val="5B6573"/>
           <w:sz w:val="19"/>
         </w:rPr>
-        <w:t>스크롤·재진입·초기화·색상 변경을 연속 수행해도 화면과 저장값이 일치하고 같은 패턴의 회귀를 공통 방식으로 수정할 수 있게 됐습니다.</w:t>
+        <w:t>스크롤, 재진입, 초기화, 색상 변경을 연속 수행해도 화면과 저장값이 일치하고 같은 패턴의 회귀를 공통 방식으로 수정할 수 있게 됐습니다.</w:t>
       </w:r>
     </w:p>
     <w:p>
@@ -1539,7 +1539,7 @@
         <w:pageBreakBefore/>
       </w:pPr>
       <w:r>
-        <w:t>기술 스택·업무 방식·협업 강점</w:t>
+        <w:t>기술 스택, 업무 방식, 협업 강점</w:t>
       </w:r>
     </w:p>
     <w:p>
@@ -1708,7 +1708,7 @@
                 <w:color w:val="1F4D78"/>
                 <w:sz w:val="20"/>
               </w:rPr>
-              <w:t>상태·비동기</w:t>
+              <w:t>상태, 비동기</w:t>
             </w:r>
           </w:p>
         </w:tc>
@@ -1786,7 +1786,7 @@
                 <w:color w:val="000000"/>
                 <w:sz w:val="20"/>
               </w:rPr>
-              <w:t>레거시 Java↔Kotlin, 멀티모듈, AAR/SDK 통합, 요청 큐, 조회·실시간 데이터 생명주기</w:t>
+              <w:t>레거시 Java↔Kotlin, 멀티모듈, AAR/SDK 통합, 요청 큐, 조회, 실시간 데이터 생명주기</w:t>
             </w:r>
           </w:p>
         </w:tc>
@@ -1814,7 +1814,7 @@
                 <w:color w:val="1F4D78"/>
                 <w:sz w:val="20"/>
               </w:rPr>
-              <w:t>차트·금융</w:t>
+              <w:t>차트, 금융</w:t>
             </w:r>
           </w:p>
         </w:tc>
@@ -1839,7 +1839,7 @@
                 <w:color w:val="000000"/>
                 <w:sz w:val="20"/>
               </w:rPr>
-              <w:t>PowerGraphics V3, Android Canvas, OHLCV, 기술적 지표, 시장·종목·주기, TR 데이터</w:t>
+              <w:t>PowerGraphics V3, Android Canvas, OHLCV, 기술적 지표, 시장, 종목, 주기, TR 데이터</w:t>
             </w:r>
           </w:p>
         </w:tc>
@@ -1867,7 +1867,7 @@
                 <w:color w:val="1F4D78"/>
                 <w:sz w:val="20"/>
               </w:rPr>
-              <w:t>빌드·형상관리</w:t>
+              <w:t>빌드, 형상관리</w:t>
             </w:r>
           </w:p>
         </w:tc>
@@ -1892,7 +1892,7 @@
                 <w:color w:val="000000"/>
                 <w:sz w:val="20"/>
               </w:rPr>
-              <w:t>Gradle Kotlin DSL/Groovy, Maven/AAR, Git, SVN, 운영 버전·배포 산출물 관리</w:t>
+              <w:t>Gradle Kotlin DSL/Groovy, Maven/AAR, Git, SVN, 운영 버전, 배포 산출물 관리</w:t>
             </w:r>
           </w:p>
         </w:tc>
@@ -1920,7 +1920,7 @@
                 <w:color w:val="1F4D78"/>
                 <w:sz w:val="20"/>
               </w:rPr>
-              <w:t>Web·문서화</w:t>
+              <w:t>Web, 문서화</w:t>
             </w:r>
           </w:p>
         </w:tc>
@@ -1945,7 +1945,7 @@
                 <w:color w:val="000000"/>
                 <w:sz w:val="20"/>
               </w:rPr>
-              <w:t>React, Vite, SCSS, Headless CMS, 지도·문의 연동, API 매뉴얼, 배포·운영 가이드</w:t>
+              <w:t>React, Vite, SCSS, Headless CMS, 지도, 문의 연동, API 매뉴얼, 배포, 운영 가이드</w:t>
             </w:r>
           </w:p>
         </w:tc>
@@ -1975,7 +1975,7 @@
           <w:color w:val="000000"/>
           <w:sz w:val="21"/>
         </w:rPr>
-        <w:t>정확성·안정성 우선</w:t>
+        <w:t>정확성, 안정성 우선</w:t>
       </w:r>
       <w:r>
         <w:rPr>
@@ -2039,7 +2039,7 @@
           <w:color w:val="000000"/>
           <w:sz w:val="21"/>
         </w:rPr>
-        <w:t xml:space="preserve"> — 요구사항과 재현 조건을 구체화하고 최소 변경, 회귀 확인, 버전·산출물 구분으로 릴리스 위험을 관리</w:t>
+        <w:t xml:space="preserve"> — 요구사항과 재현 조건을 구체화하고 최소 변경, 회귀 확인, 버전, 산출물 구분으로 릴리스 위험을 관리</w:t>
       </w:r>
     </w:p>
     <w:p>
@@ -2066,7 +2066,7 @@
           <w:color w:val="000000"/>
           <w:sz w:val="21"/>
         </w:rPr>
-        <w:t xml:space="preserve"> — 코드·API 문서·샘플·운영 가이드를 같은 기준으로 유지해 고객사, 개발자, 운영 담당자의 확인 절차를 정렬</w:t>
+        <w:t xml:space="preserve"> — 코드, API 문서, 샘플, 운영 가이드를 같은 기준으로 유지해 고객사, 개발자, 운영 담당자의 확인 절차를 정렬</w:t>
       </w:r>
     </w:p>
     <w:p>
@@ -2102,7 +2102,7 @@
           <w:color w:val="000000"/>
           <w:sz w:val="21"/>
         </w:rPr>
-        <w:t xml:space="preserve"> — 화면·컨트롤 구현부터 상태 관리, SDK·엔진 연동과 운영 유지보수까지 제품 수명주기 전반에 기여</w:t>
+        <w:t xml:space="preserve"> — 화면, 컨트롤 구현부터 상태 관리, SDK, 엔진 연동과 운영 유지보수까지 제품 수명주기 전반에 기여</w:t>
       </w:r>
     </w:p>
     <w:p>
@@ -2119,7 +2119,7 @@
           <w:color w:val="000000"/>
           <w:sz w:val="21"/>
         </w:rPr>
-        <w:t>SI·금융·공공 시스템 통합</w:t>
+        <w:t>SI, 금융, 공공 시스템 통합</w:t>
       </w:r>
       <w:r>
         <w:rPr>
@@ -2146,7 +2146,7 @@
           <w:color w:val="000000"/>
           <w:sz w:val="21"/>
         </w:rPr>
-        <w:t>고객·현업 협업</w:t>
+        <w:t>고객, 현업 협업</w:t>
       </w:r>
       <w:r>
         <w:rPr>

</xml_diff>